<commit_message>
Updated the lab instructions and code review form.  Changed image location
</commit_message>
<xml_diff>
--- a/Labs/Lab05-HtmlCanvas/CS233JS_Lab05_CodeReviewForm.docx
+++ b/Labs/Lab05-HtmlCanvas/CS233JS_Lab05_CodeReviewForm.docx
@@ -1,6 +1,6 @@
 
 <file path=word/document.xml><?xml version="1.0" encoding="utf-8"?>
-<w:document xmlns:wpc="http://schemas.microsoft.com/office/word/2010/wordprocessingCanvas" xmlns:cx="http://schemas.microsoft.com/office/drawing/2014/chartex" xmlns:cx1="http://schemas.microsoft.com/office/drawing/2015/9/8/chartex" xmlns:cx2="http://schemas.microsoft.com/office/drawing/2015/10/21/chartex" xmlns:cx3="http://schemas.microsoft.com/office/drawing/2016/5/9/chartex" xmlns:cx4="http://schemas.microsoft.com/office/drawing/2016/5/10/chartex" xmlns:cx5="http://schemas.microsoft.com/office/drawing/2016/5/11/chartex" xmlns:cx6="http://schemas.microsoft.com/office/drawing/2016/5/12/chartex" xmlns:cx7="http://schemas.microsoft.com/office/drawing/2016/5/13/chartex" xmlns:cx8="http://schemas.microsoft.com/office/drawing/2016/5/14/chartex" xmlns:mc="http://schemas.openxmlformats.org/markup-compatibility/2006" xmlns:aink="http://schemas.microsoft.com/office/drawing/2016/ink" xmlns:am3d="http://schemas.microsoft.com/office/drawing/2017/model3d" xmlns:o="urn:schemas-microsoft-com:office:office" xmlns:oel="http://schemas.microsoft.com/office/2019/extlst" xmlns:r="http://schemas.openxmlformats.org/officeDocument/2006/relationships" xmlns:m="http://schemas.openxmlformats.org/officeDocument/2006/math" xmlns:v="urn:schemas-microsoft-com:vml" xmlns:wp14="http://schemas.microsoft.com/office/word/2010/wordprocessingDrawing" xmlns:wp="http://schemas.openxmlformats.org/drawingml/2006/wordprocessingDrawing" xmlns:w10="urn:schemas-microsoft-com:office:word" xmlns:w="http://schemas.openxmlformats.org/wordprocessingml/2006/main" xmlns:w14="http://schemas.microsoft.com/office/word/2010/wordml" xmlns:w15="http://schemas.microsoft.com/office/word/2012/wordml" xmlns:w16cex="http://schemas.microsoft.com/office/word/2018/wordml/cex" xmlns:w16cid="http://schemas.microsoft.com/office/word/2016/wordml/cid" xmlns:w16="http://schemas.microsoft.com/office/word/2018/wordml" xmlns:w16du="http://schemas.microsoft.com/office/word/2023/wordml/word16du" xmlns:w16sdtdh="http://schemas.microsoft.com/office/word/2020/wordml/sdtdatahash" xmlns:w16se="http://schemas.microsoft.com/office/word/2015/wordml/symex" xmlns:wpg="http://schemas.microsoft.com/office/word/2010/wordprocessingGroup" xmlns:wpi="http://schemas.microsoft.com/office/word/2010/wordprocessingInk" xmlns:wne="http://schemas.microsoft.com/office/word/2006/wordml" xmlns:wps="http://schemas.microsoft.com/office/word/2010/wordprocessingShape" mc:Ignorable="w14 w15 w16se w16cid w16 w16cex w16sdtdh w16du wp14">
+<w:document xmlns:wpc="http://schemas.microsoft.com/office/word/2010/wordprocessingCanvas" xmlns:cx="http://schemas.microsoft.com/office/drawing/2014/chartex" xmlns:cx1="http://schemas.microsoft.com/office/drawing/2015/9/8/chartex" xmlns:cx2="http://schemas.microsoft.com/office/drawing/2015/10/21/chartex" xmlns:cx3="http://schemas.microsoft.com/office/drawing/2016/5/9/chartex" xmlns:cx4="http://schemas.microsoft.com/office/drawing/2016/5/10/chartex" xmlns:cx5="http://schemas.microsoft.com/office/drawing/2016/5/11/chartex" xmlns:cx6="http://schemas.microsoft.com/office/drawing/2016/5/12/chartex" xmlns:cx7="http://schemas.microsoft.com/office/drawing/2016/5/13/chartex" xmlns:cx8="http://schemas.microsoft.com/office/drawing/2016/5/14/chartex" xmlns:mc="http://schemas.openxmlformats.org/markup-compatibility/2006" xmlns:aink="http://schemas.microsoft.com/office/drawing/2016/ink" xmlns:am3d="http://schemas.microsoft.com/office/drawing/2017/model3d" xmlns:o="urn:schemas-microsoft-com:office:office" xmlns:oel="http://schemas.microsoft.com/office/2019/extlst" xmlns:r="http://schemas.openxmlformats.org/officeDocument/2006/relationships" xmlns:m="http://schemas.openxmlformats.org/officeDocument/2006/math" xmlns:v="urn:schemas-microsoft-com:vml" xmlns:wp14="http://schemas.microsoft.com/office/word/2010/wordprocessingDrawing" xmlns:wp="http://schemas.openxmlformats.org/drawingml/2006/wordprocessingDrawing" xmlns:w10="urn:schemas-microsoft-com:office:word" xmlns:w="http://schemas.openxmlformats.org/wordprocessingml/2006/main" xmlns:w14="http://schemas.microsoft.com/office/word/2010/wordml" xmlns:w15="http://schemas.microsoft.com/office/word/2012/wordml" xmlns:w16cex="http://schemas.microsoft.com/office/word/2018/wordml/cex" xmlns:w16cid="http://schemas.microsoft.com/office/word/2016/wordml/cid" xmlns:w16="http://schemas.microsoft.com/office/word/2018/wordml" xmlns:w16du="http://schemas.microsoft.com/office/word/2023/wordml/word16du" xmlns:w16sdtdh="http://schemas.microsoft.com/office/word/2020/wordml/sdtdatahash" xmlns:w16sdtfl="http://schemas.microsoft.com/office/word/2024/wordml/sdtformatlock" xmlns:w16se="http://schemas.microsoft.com/office/word/2015/wordml/symex" xmlns:wpg="http://schemas.microsoft.com/office/word/2010/wordprocessingGroup" xmlns:wpi="http://schemas.microsoft.com/office/word/2010/wordprocessingInk" xmlns:wne="http://schemas.microsoft.com/office/word/2006/wordml" xmlns:wps="http://schemas.microsoft.com/office/word/2010/wordprocessingShape" mc:Ignorable="w14 w15 w16se w16cid w16 w16cex w16sdtdh w16sdtfl w16du wp14">
   <w:body>
     <w:tbl>
       <w:tblPr>
@@ -613,10 +613,7 @@
               <w:t>Is the repository private</w:t>
             </w:r>
             <w:r>
-              <w:t>, are</w:t>
-            </w:r>
-            <w:r>
-              <w:t xml:space="preserve"> lab partners and the instructor added as collaborators?</w:t>
+              <w:t>, are lab partners and the instructor added as collaborators?</w:t>
             </w:r>
           </w:p>
         </w:tc>
@@ -715,10 +712,7 @@
             <w:proofErr w:type="spellEnd"/>
             <w:proofErr w:type="gramEnd"/>
             <w:r>
-              <w:t xml:space="preserve"> file</w:t>
-            </w:r>
-            <w:r>
-              <w:t xml:space="preserve"> and are non-source files excluded from the repo?</w:t>
+              <w:t xml:space="preserve"> file and are non-source files excluded from the repo?</w:t>
             </w:r>
           </w:p>
         </w:tc>
@@ -1360,10 +1354,7 @@
               <w:spacing w:after="0" w:line="240" w:lineRule="auto"/>
             </w:pPr>
             <w:r>
-              <w:t>Overall c</w:t>
-            </w:r>
-            <w:r>
-              <w:t>omments</w:t>
+              <w:t>Overall comments</w:t>
             </w:r>
           </w:p>
         </w:tc>
@@ -1465,14 +1456,7 @@
           <w:sz w:val="28"/>
         </w:rPr>
         <w:lastRenderedPageBreak/>
-        <w:t xml:space="preserve">General </w:t>
-      </w:r>
-      <w:r>
-        <w:rPr>
-          <w:b/>
-          <w:sz w:val="28"/>
-        </w:rPr>
-        <w:t>Features Added to the Profile Maker</w:t>
+        <w:t>General Features Added to the Profile Maker</w:t>
       </w:r>
     </w:p>
     <w:tbl>
@@ -1707,13 +1691,8 @@
               <w:spacing w:after="0" w:line="240" w:lineRule="auto"/>
             </w:pPr>
             <w:r>
-              <w:t xml:space="preserve">At least 4 photo filters are available in a drop-down </w:t>
-            </w:r>
-            <w:proofErr w:type="gramStart"/>
-            <w:r>
-              <w:t>list?</w:t>
-            </w:r>
-            <w:proofErr w:type="gramEnd"/>
+              <w:t>At least 4 photo filters are available in a drop-down list?</w:t>
+            </w:r>
             <w:r>
               <w:t xml:space="preserve"> </w:t>
             </w:r>
@@ -1828,6 +1807,9 @@
         </w:tc>
       </w:tr>
       <w:tr>
+        <w:trPr>
+          <w:trHeight w:val="287"/>
+        </w:trPr>
         <w:tc>
           <w:tcPr>
             <w:tcW w:w="7987" w:type="dxa"/>
@@ -1836,6 +1818,67 @@
               <w:left w:val="single" w:sz="4" w:space="0" w:color="000000"/>
               <w:bottom w:val="single" w:sz="4" w:space="0" w:color="000000"/>
             </w:tcBorders>
+            <w:shd w:val="clear" w:color="auto" w:fill="FFFFFF" w:themeFill="background1"/>
+          </w:tcPr>
+          <w:p>
+            <w:pPr>
+              <w:widowControl w:val="0"/>
+              <w:autoSpaceDE w:val="0"/>
+              <w:snapToGrid w:val="0"/>
+              <w:spacing w:after="0" w:line="240" w:lineRule="auto"/>
+            </w:pPr>
+          </w:p>
+        </w:tc>
+        <w:tc>
+          <w:tcPr>
+            <w:tcW w:w="720" w:type="dxa"/>
+            <w:tcBorders>
+              <w:top w:val="single" w:sz="4" w:space="0" w:color="000000"/>
+              <w:left w:val="single" w:sz="4" w:space="0" w:color="000000"/>
+              <w:bottom w:val="single" w:sz="4" w:space="0" w:color="000000"/>
+              <w:right w:val="single" w:sz="4" w:space="0" w:color="000000"/>
+            </w:tcBorders>
+            <w:shd w:val="clear" w:color="auto" w:fill="FFFFFF" w:themeFill="background1"/>
+          </w:tcPr>
+          <w:p>
+            <w:pPr>
+              <w:widowControl w:val="0"/>
+              <w:autoSpaceDE w:val="0"/>
+              <w:snapToGrid w:val="0"/>
+              <w:spacing w:after="0" w:line="240" w:lineRule="auto"/>
+            </w:pPr>
+          </w:p>
+        </w:tc>
+        <w:tc>
+          <w:tcPr>
+            <w:tcW w:w="833" w:type="dxa"/>
+            <w:tcBorders>
+              <w:top w:val="single" w:sz="4" w:space="0" w:color="000000"/>
+              <w:left w:val="single" w:sz="4" w:space="0" w:color="000000"/>
+              <w:bottom w:val="single" w:sz="4" w:space="0" w:color="000000"/>
+              <w:right w:val="single" w:sz="4" w:space="0" w:color="000000"/>
+            </w:tcBorders>
+            <w:shd w:val="clear" w:color="auto" w:fill="FFFFFF" w:themeFill="background1"/>
+          </w:tcPr>
+          <w:p>
+            <w:pPr>
+              <w:widowControl w:val="0"/>
+              <w:autoSpaceDE w:val="0"/>
+              <w:snapToGrid w:val="0"/>
+              <w:spacing w:after="0" w:line="240" w:lineRule="auto"/>
+            </w:pPr>
+          </w:p>
+        </w:tc>
+      </w:tr>
+      <w:tr>
+        <w:tc>
+          <w:tcPr>
+            <w:tcW w:w="7987" w:type="dxa"/>
+            <w:tcBorders>
+              <w:top w:val="single" w:sz="4" w:space="0" w:color="000000"/>
+              <w:left w:val="single" w:sz="4" w:space="0" w:color="000000"/>
+              <w:bottom w:val="single" w:sz="4" w:space="0" w:color="000000"/>
+            </w:tcBorders>
             <w:shd w:val="pct5" w:color="auto" w:fill="auto"/>
           </w:tcPr>
           <w:p>
@@ -1856,6 +1899,162 @@
             </w:r>
             <w:r>
               <w:t>)?</w:t>
+            </w:r>
+          </w:p>
+        </w:tc>
+        <w:tc>
+          <w:tcPr>
+            <w:tcW w:w="720" w:type="dxa"/>
+            <w:tcBorders>
+              <w:top w:val="single" w:sz="4" w:space="0" w:color="000000"/>
+              <w:left w:val="single" w:sz="4" w:space="0" w:color="000000"/>
+              <w:bottom w:val="single" w:sz="4" w:space="0" w:color="000000"/>
+              <w:right w:val="single" w:sz="4" w:space="0" w:color="000000"/>
+            </w:tcBorders>
+            <w:shd w:val="clear" w:color="auto" w:fill="FFFFFF" w:themeFill="background1"/>
+          </w:tcPr>
+          <w:p>
+            <w:pPr>
+              <w:widowControl w:val="0"/>
+              <w:autoSpaceDE w:val="0"/>
+              <w:snapToGrid w:val="0"/>
+              <w:spacing w:after="0" w:line="240" w:lineRule="auto"/>
+            </w:pPr>
+          </w:p>
+        </w:tc>
+        <w:tc>
+          <w:tcPr>
+            <w:tcW w:w="833" w:type="dxa"/>
+            <w:tcBorders>
+              <w:top w:val="single" w:sz="4" w:space="0" w:color="000000"/>
+              <w:left w:val="single" w:sz="4" w:space="0" w:color="000000"/>
+              <w:bottom w:val="single" w:sz="4" w:space="0" w:color="000000"/>
+              <w:right w:val="single" w:sz="4" w:space="0" w:color="000000"/>
+            </w:tcBorders>
+            <w:shd w:val="clear" w:color="auto" w:fill="FFFFFF" w:themeFill="background1"/>
+          </w:tcPr>
+          <w:p>
+            <w:pPr>
+              <w:widowControl w:val="0"/>
+              <w:autoSpaceDE w:val="0"/>
+              <w:snapToGrid w:val="0"/>
+              <w:spacing w:after="0" w:line="240" w:lineRule="auto"/>
+            </w:pPr>
+          </w:p>
+        </w:tc>
+      </w:tr>
+      <w:tr>
+        <w:trPr>
+          <w:trHeight w:val="287"/>
+        </w:trPr>
+        <w:tc>
+          <w:tcPr>
+            <w:tcW w:w="7987" w:type="dxa"/>
+            <w:tcBorders>
+              <w:top w:val="single" w:sz="4" w:space="0" w:color="000000"/>
+              <w:left w:val="single" w:sz="4" w:space="0" w:color="000000"/>
+              <w:bottom w:val="single" w:sz="4" w:space="0" w:color="000000"/>
+            </w:tcBorders>
+            <w:shd w:val="clear" w:color="auto" w:fill="FFFFFF" w:themeFill="background1"/>
+          </w:tcPr>
+          <w:p>
+            <w:pPr>
+              <w:widowControl w:val="0"/>
+              <w:autoSpaceDE w:val="0"/>
+              <w:snapToGrid w:val="0"/>
+              <w:spacing w:after="0" w:line="240" w:lineRule="auto"/>
+            </w:pPr>
+            <w:r>
+              <w:t>NPM pacakge</w:t>
+            </w:r>
+            <w:r>
+              <w:t xml:space="preserve"> used: </w:t>
+            </w:r>
+          </w:p>
+        </w:tc>
+        <w:tc>
+          <w:tcPr>
+            <w:tcW w:w="720" w:type="dxa"/>
+            <w:tcBorders>
+              <w:top w:val="single" w:sz="4" w:space="0" w:color="000000"/>
+              <w:left w:val="single" w:sz="4" w:space="0" w:color="000000"/>
+              <w:bottom w:val="single" w:sz="4" w:space="0" w:color="000000"/>
+              <w:right w:val="single" w:sz="4" w:space="0" w:color="000000"/>
+            </w:tcBorders>
+            <w:shd w:val="clear" w:color="auto" w:fill="FFFFFF" w:themeFill="background1"/>
+          </w:tcPr>
+          <w:p>
+            <w:pPr>
+              <w:widowControl w:val="0"/>
+              <w:autoSpaceDE w:val="0"/>
+              <w:snapToGrid w:val="0"/>
+              <w:spacing w:after="0" w:line="240" w:lineRule="auto"/>
+            </w:pPr>
+          </w:p>
+        </w:tc>
+        <w:tc>
+          <w:tcPr>
+            <w:tcW w:w="833" w:type="dxa"/>
+            <w:tcBorders>
+              <w:top w:val="single" w:sz="4" w:space="0" w:color="000000"/>
+              <w:left w:val="single" w:sz="4" w:space="0" w:color="000000"/>
+              <w:bottom w:val="single" w:sz="4" w:space="0" w:color="000000"/>
+              <w:right w:val="single" w:sz="4" w:space="0" w:color="000000"/>
+            </w:tcBorders>
+            <w:shd w:val="clear" w:color="auto" w:fill="FFFFFF" w:themeFill="background1"/>
+          </w:tcPr>
+          <w:p>
+            <w:pPr>
+              <w:widowControl w:val="0"/>
+              <w:autoSpaceDE w:val="0"/>
+              <w:snapToGrid w:val="0"/>
+              <w:spacing w:after="0" w:line="240" w:lineRule="auto"/>
+            </w:pPr>
+          </w:p>
+        </w:tc>
+      </w:tr>
+      <w:tr>
+        <w:tc>
+          <w:tcPr>
+            <w:tcW w:w="9540" w:type="dxa"/>
+            <w:gridSpan w:val="3"/>
+            <w:tcBorders>
+              <w:top w:val="single" w:sz="4" w:space="0" w:color="000000"/>
+              <w:left w:val="single" w:sz="4" w:space="0" w:color="000000"/>
+              <w:bottom w:val="single" w:sz="4" w:space="0" w:color="000000"/>
+              <w:right w:val="single" w:sz="4" w:space="0" w:color="000000"/>
+            </w:tcBorders>
+          </w:tcPr>
+          <w:p>
+            <w:pPr>
+              <w:widowControl w:val="0"/>
+              <w:autoSpaceDE w:val="0"/>
+              <w:snapToGrid w:val="0"/>
+              <w:spacing w:after="0" w:line="240" w:lineRule="auto"/>
+            </w:pPr>
+          </w:p>
+        </w:tc>
+      </w:tr>
+      <w:tr>
+        <w:tc>
+          <w:tcPr>
+            <w:tcW w:w="7987" w:type="dxa"/>
+            <w:tcBorders>
+              <w:top w:val="single" w:sz="4" w:space="0" w:color="000000"/>
+              <w:left w:val="single" w:sz="4" w:space="0" w:color="000000"/>
+              <w:bottom w:val="single" w:sz="4" w:space="0" w:color="000000"/>
+            </w:tcBorders>
+            <w:shd w:val="pct5" w:color="auto" w:fill="auto"/>
+          </w:tcPr>
+          <w:p>
+            <w:pPr>
+              <w:widowControl w:val="0"/>
+              <w:autoSpaceDE w:val="0"/>
+              <w:snapToGrid w:val="0"/>
+              <w:spacing w:after="0" w:line="240" w:lineRule="auto"/>
+            </w:pPr>
+            <w:r>
+              <w:t>Option to add an outline to the text and choose its color.</w:t>
             </w:r>
           </w:p>
         </w:tc>
@@ -2343,92 +2542,6 @@
               <w:spacing w:after="0" w:line="240" w:lineRule="auto"/>
             </w:pPr>
             <w:r>
-              <w:t>Option to add an outline to the text and choose its color.</w:t>
-            </w:r>
-          </w:p>
-        </w:tc>
-        <w:tc>
-          <w:tcPr>
-            <w:tcW w:w="720" w:type="dxa"/>
-            <w:tcBorders>
-              <w:top w:val="single" w:sz="4" w:space="0" w:color="000000"/>
-              <w:left w:val="single" w:sz="4" w:space="0" w:color="000000"/>
-              <w:bottom w:val="single" w:sz="4" w:space="0" w:color="000000"/>
-              <w:right w:val="single" w:sz="4" w:space="0" w:color="000000"/>
-            </w:tcBorders>
-            <w:shd w:val="clear" w:color="auto" w:fill="FFFFFF" w:themeFill="background1"/>
-          </w:tcPr>
-          <w:p>
-            <w:pPr>
-              <w:widowControl w:val="0"/>
-              <w:autoSpaceDE w:val="0"/>
-              <w:snapToGrid w:val="0"/>
-              <w:spacing w:after="0" w:line="240" w:lineRule="auto"/>
-            </w:pPr>
-          </w:p>
-        </w:tc>
-        <w:tc>
-          <w:tcPr>
-            <w:tcW w:w="833" w:type="dxa"/>
-            <w:tcBorders>
-              <w:top w:val="single" w:sz="4" w:space="0" w:color="000000"/>
-              <w:left w:val="single" w:sz="4" w:space="0" w:color="000000"/>
-              <w:bottom w:val="single" w:sz="4" w:space="0" w:color="000000"/>
-              <w:right w:val="single" w:sz="4" w:space="0" w:color="000000"/>
-            </w:tcBorders>
-            <w:shd w:val="clear" w:color="auto" w:fill="FFFFFF" w:themeFill="background1"/>
-          </w:tcPr>
-          <w:p>
-            <w:pPr>
-              <w:widowControl w:val="0"/>
-              <w:autoSpaceDE w:val="0"/>
-              <w:snapToGrid w:val="0"/>
-              <w:spacing w:after="0" w:line="240" w:lineRule="auto"/>
-            </w:pPr>
-          </w:p>
-        </w:tc>
-      </w:tr>
-      <w:tr>
-        <w:tc>
-          <w:tcPr>
-            <w:tcW w:w="9540" w:type="dxa"/>
-            <w:gridSpan w:val="3"/>
-            <w:tcBorders>
-              <w:top w:val="single" w:sz="4" w:space="0" w:color="000000"/>
-              <w:left w:val="single" w:sz="4" w:space="0" w:color="000000"/>
-              <w:bottom w:val="single" w:sz="4" w:space="0" w:color="000000"/>
-              <w:right w:val="single" w:sz="4" w:space="0" w:color="000000"/>
-            </w:tcBorders>
-          </w:tcPr>
-          <w:p>
-            <w:pPr>
-              <w:widowControl w:val="0"/>
-              <w:autoSpaceDE w:val="0"/>
-              <w:snapToGrid w:val="0"/>
-              <w:spacing w:after="0" w:line="240" w:lineRule="auto"/>
-            </w:pPr>
-          </w:p>
-        </w:tc>
-      </w:tr>
-      <w:tr>
-        <w:tc>
-          <w:tcPr>
-            <w:tcW w:w="7987" w:type="dxa"/>
-            <w:tcBorders>
-              <w:top w:val="single" w:sz="4" w:space="0" w:color="000000"/>
-              <w:left w:val="single" w:sz="4" w:space="0" w:color="000000"/>
-              <w:bottom w:val="single" w:sz="4" w:space="0" w:color="000000"/>
-            </w:tcBorders>
-            <w:shd w:val="pct5" w:color="auto" w:fill="auto"/>
-          </w:tcPr>
-          <w:p>
-            <w:pPr>
-              <w:widowControl w:val="0"/>
-              <w:autoSpaceDE w:val="0"/>
-              <w:snapToGrid w:val="0"/>
-              <w:spacing w:after="0" w:line="240" w:lineRule="auto"/>
-            </w:pPr>
-            <w:r>
               <w:t>Drag and zoom your photo to get the perfect crop and positioning.</w:t>
             </w:r>
           </w:p>
@@ -2517,21 +2630,7 @@
           <w:b/>
           <w:sz w:val="28"/>
         </w:rPr>
-        <w:t xml:space="preserve">Lab Version </w:t>
-      </w:r>
-      <w:r>
-        <w:rPr>
-          <w:b/>
-          <w:sz w:val="28"/>
-        </w:rPr>
-        <w:t>B</w:t>
-      </w:r>
-      <w:r>
-        <w:rPr>
-          <w:b/>
-          <w:sz w:val="28"/>
-        </w:rPr>
-        <w:t xml:space="preserve"> Features</w:t>
+        <w:t>Lab Version B Features</w:t>
       </w:r>
     </w:p>
     <w:tbl>
@@ -2790,7 +2889,7 @@
               <w:spacing w:after="0" w:line="240" w:lineRule="auto"/>
             </w:pPr>
             <w:r>
-              <w:t>Option to add an outline to the text and choose its color.</w:t>
+              <w:t>Oval profile frame, with image or background outside the frame clipped.</w:t>
             </w:r>
           </w:p>
         </w:tc>
@@ -2876,93 +2975,7 @@
               <w:spacing w:after="0" w:line="240" w:lineRule="auto"/>
             </w:pPr>
             <w:r>
-              <w:t>Oval profile frame, with image or background outside the frame clipped.</w:t>
-            </w:r>
-          </w:p>
-        </w:tc>
-        <w:tc>
-          <w:tcPr>
-            <w:tcW w:w="720" w:type="dxa"/>
-            <w:tcBorders>
-              <w:top w:val="single" w:sz="4" w:space="0" w:color="000000"/>
-              <w:left w:val="single" w:sz="4" w:space="0" w:color="000000"/>
-              <w:bottom w:val="single" w:sz="4" w:space="0" w:color="000000"/>
-              <w:right w:val="single" w:sz="4" w:space="0" w:color="000000"/>
-            </w:tcBorders>
-            <w:shd w:val="clear" w:color="auto" w:fill="FFFFFF" w:themeFill="background1"/>
-          </w:tcPr>
-          <w:p>
-            <w:pPr>
-              <w:widowControl w:val="0"/>
-              <w:autoSpaceDE w:val="0"/>
-              <w:snapToGrid w:val="0"/>
-              <w:spacing w:after="0" w:line="240" w:lineRule="auto"/>
-            </w:pPr>
-          </w:p>
-        </w:tc>
-        <w:tc>
-          <w:tcPr>
-            <w:tcW w:w="833" w:type="dxa"/>
-            <w:tcBorders>
-              <w:top w:val="single" w:sz="4" w:space="0" w:color="000000"/>
-              <w:left w:val="single" w:sz="4" w:space="0" w:color="000000"/>
-              <w:bottom w:val="single" w:sz="4" w:space="0" w:color="000000"/>
-              <w:right w:val="single" w:sz="4" w:space="0" w:color="000000"/>
-            </w:tcBorders>
-            <w:shd w:val="clear" w:color="auto" w:fill="FFFFFF" w:themeFill="background1"/>
-          </w:tcPr>
-          <w:p>
-            <w:pPr>
-              <w:widowControl w:val="0"/>
-              <w:autoSpaceDE w:val="0"/>
-              <w:snapToGrid w:val="0"/>
-              <w:spacing w:after="0" w:line="240" w:lineRule="auto"/>
-            </w:pPr>
-          </w:p>
-        </w:tc>
-      </w:tr>
-      <w:tr>
-        <w:tc>
-          <w:tcPr>
-            <w:tcW w:w="9540" w:type="dxa"/>
-            <w:gridSpan w:val="3"/>
-            <w:tcBorders>
-              <w:top w:val="single" w:sz="4" w:space="0" w:color="000000"/>
-              <w:left w:val="single" w:sz="4" w:space="0" w:color="000000"/>
-              <w:bottom w:val="single" w:sz="4" w:space="0" w:color="000000"/>
-              <w:right w:val="single" w:sz="4" w:space="0" w:color="000000"/>
-            </w:tcBorders>
-          </w:tcPr>
-          <w:p>
-            <w:pPr>
-              <w:widowControl w:val="0"/>
-              <w:autoSpaceDE w:val="0"/>
-              <w:snapToGrid w:val="0"/>
-              <w:spacing w:after="0" w:line="240" w:lineRule="auto"/>
-            </w:pPr>
-          </w:p>
-        </w:tc>
-      </w:tr>
-      <w:tr>
-        <w:tc>
-          <w:tcPr>
-            <w:tcW w:w="7987" w:type="dxa"/>
-            <w:tcBorders>
-              <w:top w:val="single" w:sz="4" w:space="0" w:color="000000"/>
-              <w:left w:val="single" w:sz="4" w:space="0" w:color="000000"/>
-              <w:bottom w:val="single" w:sz="4" w:space="0" w:color="000000"/>
-            </w:tcBorders>
-            <w:shd w:val="pct5" w:color="auto" w:fill="auto"/>
-          </w:tcPr>
-          <w:p>
-            <w:pPr>
-              <w:widowControl w:val="0"/>
-              <w:autoSpaceDE w:val="0"/>
-              <w:snapToGrid w:val="0"/>
-              <w:spacing w:after="0" w:line="240" w:lineRule="auto"/>
-            </w:pPr>
-            <w:r>
-              <w:t>Interactive Stickers that you can place and drag anywhere on your picture.</w:t>
+              <w:t>Stickers that you can place and drag anywhere on your picture.</w:t>
             </w:r>
           </w:p>
         </w:tc>
@@ -3050,21 +3063,7 @@
           <w:b/>
           <w:sz w:val="28"/>
         </w:rPr>
-        <w:t xml:space="preserve">Lab Version </w:t>
-      </w:r>
-      <w:r>
-        <w:rPr>
-          <w:b/>
-          <w:sz w:val="28"/>
-        </w:rPr>
-        <w:t>C</w:t>
-      </w:r>
-      <w:r>
-        <w:rPr>
-          <w:b/>
-          <w:sz w:val="28"/>
-        </w:rPr>
-        <w:t xml:space="preserve"> Features</w:t>
+        <w:t>Lab Version C Features</w:t>
       </w:r>
     </w:p>
     <w:tbl>
@@ -3195,7 +3194,7 @@
               <w:spacing w:after="0" w:line="240" w:lineRule="auto"/>
             </w:pPr>
             <w:r>
-              <w:t>Controls to change font size and color.</w:t>
+              <w:t>Controls to change font family and style.</w:t>
             </w:r>
           </w:p>
         </w:tc>
@@ -3323,7 +3322,7 @@
               <w:spacing w:after="0" w:line="240" w:lineRule="auto"/>
             </w:pPr>
             <w:r>
-              <w:t>Option to add an outline to the text and choose its color.</w:t>
+              <w:t>Rectangular profile frame with rounded corners and image outside the frame clipped.</w:t>
             </w:r>
           </w:p>
         </w:tc>
@@ -3409,93 +3408,7 @@
               <w:spacing w:after="0" w:line="240" w:lineRule="auto"/>
             </w:pPr>
             <w:r>
-              <w:t>Oval profile frame, with image or background outside the frame clipped.</w:t>
-            </w:r>
-          </w:p>
-        </w:tc>
-        <w:tc>
-          <w:tcPr>
-            <w:tcW w:w="720" w:type="dxa"/>
-            <w:tcBorders>
-              <w:top w:val="single" w:sz="4" w:space="0" w:color="000000"/>
-              <w:left w:val="single" w:sz="4" w:space="0" w:color="000000"/>
-              <w:bottom w:val="single" w:sz="4" w:space="0" w:color="000000"/>
-              <w:right w:val="single" w:sz="4" w:space="0" w:color="000000"/>
-            </w:tcBorders>
-            <w:shd w:val="clear" w:color="auto" w:fill="FFFFFF" w:themeFill="background1"/>
-          </w:tcPr>
-          <w:p>
-            <w:pPr>
-              <w:widowControl w:val="0"/>
-              <w:autoSpaceDE w:val="0"/>
-              <w:snapToGrid w:val="0"/>
-              <w:spacing w:after="0" w:line="240" w:lineRule="auto"/>
-            </w:pPr>
-          </w:p>
-        </w:tc>
-        <w:tc>
-          <w:tcPr>
-            <w:tcW w:w="833" w:type="dxa"/>
-            <w:tcBorders>
-              <w:top w:val="single" w:sz="4" w:space="0" w:color="000000"/>
-              <w:left w:val="single" w:sz="4" w:space="0" w:color="000000"/>
-              <w:bottom w:val="single" w:sz="4" w:space="0" w:color="000000"/>
-              <w:right w:val="single" w:sz="4" w:space="0" w:color="000000"/>
-            </w:tcBorders>
-            <w:shd w:val="clear" w:color="auto" w:fill="FFFFFF" w:themeFill="background1"/>
-          </w:tcPr>
-          <w:p>
-            <w:pPr>
-              <w:widowControl w:val="0"/>
-              <w:autoSpaceDE w:val="0"/>
-              <w:snapToGrid w:val="0"/>
-              <w:spacing w:after="0" w:line="240" w:lineRule="auto"/>
-            </w:pPr>
-          </w:p>
-        </w:tc>
-      </w:tr>
-      <w:tr>
-        <w:tc>
-          <w:tcPr>
-            <w:tcW w:w="9540" w:type="dxa"/>
-            <w:gridSpan w:val="3"/>
-            <w:tcBorders>
-              <w:top w:val="single" w:sz="4" w:space="0" w:color="000000"/>
-              <w:left w:val="single" w:sz="4" w:space="0" w:color="000000"/>
-              <w:bottom w:val="single" w:sz="4" w:space="0" w:color="000000"/>
-              <w:right w:val="single" w:sz="4" w:space="0" w:color="000000"/>
-            </w:tcBorders>
-          </w:tcPr>
-          <w:p>
-            <w:pPr>
-              <w:widowControl w:val="0"/>
-              <w:autoSpaceDE w:val="0"/>
-              <w:snapToGrid w:val="0"/>
-              <w:spacing w:after="0" w:line="240" w:lineRule="auto"/>
-            </w:pPr>
-          </w:p>
-        </w:tc>
-      </w:tr>
-      <w:tr>
-        <w:tc>
-          <w:tcPr>
-            <w:tcW w:w="7987" w:type="dxa"/>
-            <w:tcBorders>
-              <w:top w:val="single" w:sz="4" w:space="0" w:color="000000"/>
-              <w:left w:val="single" w:sz="4" w:space="0" w:color="000000"/>
-              <w:bottom w:val="single" w:sz="4" w:space="0" w:color="000000"/>
-            </w:tcBorders>
-            <w:shd w:val="pct5" w:color="auto" w:fill="auto"/>
-          </w:tcPr>
-          <w:p>
-            <w:pPr>
-              <w:widowControl w:val="0"/>
-              <w:autoSpaceDE w:val="0"/>
-              <w:snapToGrid w:val="0"/>
-              <w:spacing w:after="0" w:line="240" w:lineRule="auto"/>
-            </w:pPr>
-            <w:r>
-              <w:t>Interactive Stickers that you can place and drag anywhere on your picture.</w:t>
+              <w:t>Freestyle drawing that lets you sketch directly on your profile picture with a pen.</w:t>
             </w:r>
           </w:p>
         </w:tc>
@@ -3582,7 +3495,7 @@
 </file>
 
 <file path=word/endnotes.xml><?xml version="1.0" encoding="utf-8"?>
-<w:endnotes xmlns:wpc="http://schemas.microsoft.com/office/word/2010/wordprocessingCanvas" xmlns:cx="http://schemas.microsoft.com/office/drawing/2014/chartex" xmlns:cx1="http://schemas.microsoft.com/office/drawing/2015/9/8/chartex" xmlns:cx2="http://schemas.microsoft.com/office/drawing/2015/10/21/chartex" xmlns:cx3="http://schemas.microsoft.com/office/drawing/2016/5/9/chartex" xmlns:cx4="http://schemas.microsoft.com/office/drawing/2016/5/10/chartex" xmlns:cx5="http://schemas.microsoft.com/office/drawing/2016/5/11/chartex" xmlns:cx6="http://schemas.microsoft.com/office/drawing/2016/5/12/chartex" xmlns:cx7="http://schemas.microsoft.com/office/drawing/2016/5/13/chartex" xmlns:cx8="http://schemas.microsoft.com/office/drawing/2016/5/14/chartex" xmlns:mc="http://schemas.openxmlformats.org/markup-compatibility/2006" xmlns:aink="http://schemas.microsoft.com/office/drawing/2016/ink" xmlns:am3d="http://schemas.microsoft.com/office/drawing/2017/model3d" xmlns:o="urn:schemas-microsoft-com:office:office" xmlns:oel="http://schemas.microsoft.com/office/2019/extlst" xmlns:r="http://schemas.openxmlformats.org/officeDocument/2006/relationships" xmlns:m="http://schemas.openxmlformats.org/officeDocument/2006/math" xmlns:v="urn:schemas-microsoft-com:vml" xmlns:wp14="http://schemas.microsoft.com/office/word/2010/wordprocessingDrawing" xmlns:wp="http://schemas.openxmlformats.org/drawingml/2006/wordprocessingDrawing" xmlns:w10="urn:schemas-microsoft-com:office:word" xmlns:w="http://schemas.openxmlformats.org/wordprocessingml/2006/main" xmlns:w14="http://schemas.microsoft.com/office/word/2010/wordml" xmlns:w15="http://schemas.microsoft.com/office/word/2012/wordml" xmlns:w16cex="http://schemas.microsoft.com/office/word/2018/wordml/cex" xmlns:w16cid="http://schemas.microsoft.com/office/word/2016/wordml/cid" xmlns:w16="http://schemas.microsoft.com/office/word/2018/wordml" xmlns:w16du="http://schemas.microsoft.com/office/word/2023/wordml/word16du" xmlns:w16sdtdh="http://schemas.microsoft.com/office/word/2020/wordml/sdtdatahash" xmlns:w16se="http://schemas.microsoft.com/office/word/2015/wordml/symex" xmlns:wpg="http://schemas.microsoft.com/office/word/2010/wordprocessingGroup" xmlns:wpi="http://schemas.microsoft.com/office/word/2010/wordprocessingInk" xmlns:wne="http://schemas.microsoft.com/office/word/2006/wordml" xmlns:wps="http://schemas.microsoft.com/office/word/2010/wordprocessingShape" mc:Ignorable="w14 w15 w16se w16cid w16 w16cex w16sdtdh w16du wp14">
+<w:endnotes xmlns:wpc="http://schemas.microsoft.com/office/word/2010/wordprocessingCanvas" xmlns:cx="http://schemas.microsoft.com/office/drawing/2014/chartex" xmlns:cx1="http://schemas.microsoft.com/office/drawing/2015/9/8/chartex" xmlns:cx2="http://schemas.microsoft.com/office/drawing/2015/10/21/chartex" xmlns:cx3="http://schemas.microsoft.com/office/drawing/2016/5/9/chartex" xmlns:cx4="http://schemas.microsoft.com/office/drawing/2016/5/10/chartex" xmlns:cx5="http://schemas.microsoft.com/office/drawing/2016/5/11/chartex" xmlns:cx6="http://schemas.microsoft.com/office/drawing/2016/5/12/chartex" xmlns:cx7="http://schemas.microsoft.com/office/drawing/2016/5/13/chartex" xmlns:cx8="http://schemas.microsoft.com/office/drawing/2016/5/14/chartex" xmlns:mc="http://schemas.openxmlformats.org/markup-compatibility/2006" xmlns:aink="http://schemas.microsoft.com/office/drawing/2016/ink" xmlns:am3d="http://schemas.microsoft.com/office/drawing/2017/model3d" xmlns:o="urn:schemas-microsoft-com:office:office" xmlns:oel="http://schemas.microsoft.com/office/2019/extlst" xmlns:r="http://schemas.openxmlformats.org/officeDocument/2006/relationships" xmlns:m="http://schemas.openxmlformats.org/officeDocument/2006/math" xmlns:v="urn:schemas-microsoft-com:vml" xmlns:wp14="http://schemas.microsoft.com/office/word/2010/wordprocessingDrawing" xmlns:wp="http://schemas.openxmlformats.org/drawingml/2006/wordprocessingDrawing" xmlns:w10="urn:schemas-microsoft-com:office:word" xmlns:w="http://schemas.openxmlformats.org/wordprocessingml/2006/main" xmlns:w14="http://schemas.microsoft.com/office/word/2010/wordml" xmlns:w15="http://schemas.microsoft.com/office/word/2012/wordml" xmlns:w16cex="http://schemas.microsoft.com/office/word/2018/wordml/cex" xmlns:w16cid="http://schemas.microsoft.com/office/word/2016/wordml/cid" xmlns:w16="http://schemas.microsoft.com/office/word/2018/wordml" xmlns:w16du="http://schemas.microsoft.com/office/word/2023/wordml/word16du" xmlns:w16sdtdh="http://schemas.microsoft.com/office/word/2020/wordml/sdtdatahash" xmlns:w16sdtfl="http://schemas.microsoft.com/office/word/2024/wordml/sdtformatlock" xmlns:w16se="http://schemas.microsoft.com/office/word/2015/wordml/symex" xmlns:wpg="http://schemas.microsoft.com/office/word/2010/wordprocessingGroup" xmlns:wpi="http://schemas.microsoft.com/office/word/2010/wordprocessingInk" xmlns:wne="http://schemas.microsoft.com/office/word/2006/wordml" xmlns:wps="http://schemas.microsoft.com/office/word/2010/wordprocessingShape" mc:Ignorable="w14 w15 w16se w16cid w16 w16cex w16sdtdh w16sdtfl w16du wp14">
   <w:endnote w:type="separator" w:id="-1">
     <w:p>
       <w:pPr>
@@ -3607,7 +3520,7 @@
 </file>
 
 <file path=word/footer1.xml><?xml version="1.0" encoding="utf-8"?>
-<w:ftr xmlns:wpc="http://schemas.microsoft.com/office/word/2010/wordprocessingCanvas" xmlns:cx="http://schemas.microsoft.com/office/drawing/2014/chartex" xmlns:cx1="http://schemas.microsoft.com/office/drawing/2015/9/8/chartex" xmlns:cx2="http://schemas.microsoft.com/office/drawing/2015/10/21/chartex" xmlns:cx3="http://schemas.microsoft.com/office/drawing/2016/5/9/chartex" xmlns:cx4="http://schemas.microsoft.com/office/drawing/2016/5/10/chartex" xmlns:cx5="http://schemas.microsoft.com/office/drawing/2016/5/11/chartex" xmlns:cx6="http://schemas.microsoft.com/office/drawing/2016/5/12/chartex" xmlns:cx7="http://schemas.microsoft.com/office/drawing/2016/5/13/chartex" xmlns:cx8="http://schemas.microsoft.com/office/drawing/2016/5/14/chartex" xmlns:mc="http://schemas.openxmlformats.org/markup-compatibility/2006" xmlns:aink="http://schemas.microsoft.com/office/drawing/2016/ink" xmlns:am3d="http://schemas.microsoft.com/office/drawing/2017/model3d" xmlns:o="urn:schemas-microsoft-com:office:office" xmlns:oel="http://schemas.microsoft.com/office/2019/extlst" xmlns:r="http://schemas.openxmlformats.org/officeDocument/2006/relationships" xmlns:m="http://schemas.openxmlformats.org/officeDocument/2006/math" xmlns:v="urn:schemas-microsoft-com:vml" xmlns:wp14="http://schemas.microsoft.com/office/word/2010/wordprocessingDrawing" xmlns:wp="http://schemas.openxmlformats.org/drawingml/2006/wordprocessingDrawing" xmlns:w10="urn:schemas-microsoft-com:office:word" xmlns:w="http://schemas.openxmlformats.org/wordprocessingml/2006/main" xmlns:w14="http://schemas.microsoft.com/office/word/2010/wordml" xmlns:w15="http://schemas.microsoft.com/office/word/2012/wordml" xmlns:w16cex="http://schemas.microsoft.com/office/word/2018/wordml/cex" xmlns:w16cid="http://schemas.microsoft.com/office/word/2016/wordml/cid" xmlns:w16="http://schemas.microsoft.com/office/word/2018/wordml" xmlns:w16du="http://schemas.microsoft.com/office/word/2023/wordml/word16du" xmlns:w16sdtdh="http://schemas.microsoft.com/office/word/2020/wordml/sdtdatahash" xmlns:w16se="http://schemas.microsoft.com/office/word/2015/wordml/symex" xmlns:wpg="http://schemas.microsoft.com/office/word/2010/wordprocessingGroup" xmlns:wpi="http://schemas.microsoft.com/office/word/2010/wordprocessingInk" xmlns:wne="http://schemas.microsoft.com/office/word/2006/wordml" xmlns:wps="http://schemas.microsoft.com/office/word/2010/wordprocessingShape" mc:Ignorable="w14 w15 w16se w16cid w16 w16cex w16sdtdh w16du wp14">
+<w:ftr xmlns:wpc="http://schemas.microsoft.com/office/word/2010/wordprocessingCanvas" xmlns:cx="http://schemas.microsoft.com/office/drawing/2014/chartex" xmlns:cx1="http://schemas.microsoft.com/office/drawing/2015/9/8/chartex" xmlns:cx2="http://schemas.microsoft.com/office/drawing/2015/10/21/chartex" xmlns:cx3="http://schemas.microsoft.com/office/drawing/2016/5/9/chartex" xmlns:cx4="http://schemas.microsoft.com/office/drawing/2016/5/10/chartex" xmlns:cx5="http://schemas.microsoft.com/office/drawing/2016/5/11/chartex" xmlns:cx6="http://schemas.microsoft.com/office/drawing/2016/5/12/chartex" xmlns:cx7="http://schemas.microsoft.com/office/drawing/2016/5/13/chartex" xmlns:cx8="http://schemas.microsoft.com/office/drawing/2016/5/14/chartex" xmlns:mc="http://schemas.openxmlformats.org/markup-compatibility/2006" xmlns:aink="http://schemas.microsoft.com/office/drawing/2016/ink" xmlns:am3d="http://schemas.microsoft.com/office/drawing/2017/model3d" xmlns:o="urn:schemas-microsoft-com:office:office" xmlns:oel="http://schemas.microsoft.com/office/2019/extlst" xmlns:r="http://schemas.openxmlformats.org/officeDocument/2006/relationships" xmlns:m="http://schemas.openxmlformats.org/officeDocument/2006/math" xmlns:v="urn:schemas-microsoft-com:vml" xmlns:wp14="http://schemas.microsoft.com/office/word/2010/wordprocessingDrawing" xmlns:wp="http://schemas.openxmlformats.org/drawingml/2006/wordprocessingDrawing" xmlns:w10="urn:schemas-microsoft-com:office:word" xmlns:w="http://schemas.openxmlformats.org/wordprocessingml/2006/main" xmlns:w14="http://schemas.microsoft.com/office/word/2010/wordml" xmlns:w15="http://schemas.microsoft.com/office/word/2012/wordml" xmlns:w16cex="http://schemas.microsoft.com/office/word/2018/wordml/cex" xmlns:w16cid="http://schemas.microsoft.com/office/word/2016/wordml/cid" xmlns:w16="http://schemas.microsoft.com/office/word/2018/wordml" xmlns:w16du="http://schemas.microsoft.com/office/word/2023/wordml/word16du" xmlns:w16sdtdh="http://schemas.microsoft.com/office/word/2020/wordml/sdtdatahash" xmlns:w16sdtfl="http://schemas.microsoft.com/office/word/2024/wordml/sdtformatlock" xmlns:w16se="http://schemas.microsoft.com/office/word/2015/wordml/symex" xmlns:wpg="http://schemas.microsoft.com/office/word/2010/wordprocessingGroup" xmlns:wpi="http://schemas.microsoft.com/office/word/2010/wordprocessingInk" xmlns:wne="http://schemas.microsoft.com/office/word/2006/wordml" xmlns:wps="http://schemas.microsoft.com/office/word/2010/wordprocessingShape" mc:Ignorable="w14 w15 w16se w16cid w16 w16cex w16sdtdh w16sdtfl w16du wp14">
   <w:p>
     <w:pPr>
       <w:pStyle w:val="Footer"/>
@@ -3635,7 +3548,7 @@
 </file>
 
 <file path=word/footnotes.xml><?xml version="1.0" encoding="utf-8"?>
-<w:footnotes xmlns:wpc="http://schemas.microsoft.com/office/word/2010/wordprocessingCanvas" xmlns:cx="http://schemas.microsoft.com/office/drawing/2014/chartex" xmlns:cx1="http://schemas.microsoft.com/office/drawing/2015/9/8/chartex" xmlns:cx2="http://schemas.microsoft.com/office/drawing/2015/10/21/chartex" xmlns:cx3="http://schemas.microsoft.com/office/drawing/2016/5/9/chartex" xmlns:cx4="http://schemas.microsoft.com/office/drawing/2016/5/10/chartex" xmlns:cx5="http://schemas.microsoft.com/office/drawing/2016/5/11/chartex" xmlns:cx6="http://schemas.microsoft.com/office/drawing/2016/5/12/chartex" xmlns:cx7="http://schemas.microsoft.com/office/drawing/2016/5/13/chartex" xmlns:cx8="http://schemas.microsoft.com/office/drawing/2016/5/14/chartex" xmlns:mc="http://schemas.openxmlformats.org/markup-compatibility/2006" xmlns:aink="http://schemas.microsoft.com/office/drawing/2016/ink" xmlns:am3d="http://schemas.microsoft.com/office/drawing/2017/model3d" xmlns:o="urn:schemas-microsoft-com:office:office" xmlns:oel="http://schemas.microsoft.com/office/2019/extlst" xmlns:r="http://schemas.openxmlformats.org/officeDocument/2006/relationships" xmlns:m="http://schemas.openxmlformats.org/officeDocument/2006/math" xmlns:v="urn:schemas-microsoft-com:vml" xmlns:wp14="http://schemas.microsoft.com/office/word/2010/wordprocessingDrawing" xmlns:wp="http://schemas.openxmlformats.org/drawingml/2006/wordprocessingDrawing" xmlns:w10="urn:schemas-microsoft-com:office:word" xmlns:w="http://schemas.openxmlformats.org/wordprocessingml/2006/main" xmlns:w14="http://schemas.microsoft.com/office/word/2010/wordml" xmlns:w15="http://schemas.microsoft.com/office/word/2012/wordml" xmlns:w16cex="http://schemas.microsoft.com/office/word/2018/wordml/cex" xmlns:w16cid="http://schemas.microsoft.com/office/word/2016/wordml/cid" xmlns:w16="http://schemas.microsoft.com/office/word/2018/wordml" xmlns:w16du="http://schemas.microsoft.com/office/word/2023/wordml/word16du" xmlns:w16sdtdh="http://schemas.microsoft.com/office/word/2020/wordml/sdtdatahash" xmlns:w16se="http://schemas.microsoft.com/office/word/2015/wordml/symex" xmlns:wpg="http://schemas.microsoft.com/office/word/2010/wordprocessingGroup" xmlns:wpi="http://schemas.microsoft.com/office/word/2010/wordprocessingInk" xmlns:wne="http://schemas.microsoft.com/office/word/2006/wordml" xmlns:wps="http://schemas.microsoft.com/office/word/2010/wordprocessingShape" mc:Ignorable="w14 w15 w16se w16cid w16 w16cex w16sdtdh w16du wp14">
+<w:footnotes xmlns:wpc="http://schemas.microsoft.com/office/word/2010/wordprocessingCanvas" xmlns:cx="http://schemas.microsoft.com/office/drawing/2014/chartex" xmlns:cx1="http://schemas.microsoft.com/office/drawing/2015/9/8/chartex" xmlns:cx2="http://schemas.microsoft.com/office/drawing/2015/10/21/chartex" xmlns:cx3="http://schemas.microsoft.com/office/drawing/2016/5/9/chartex" xmlns:cx4="http://schemas.microsoft.com/office/drawing/2016/5/10/chartex" xmlns:cx5="http://schemas.microsoft.com/office/drawing/2016/5/11/chartex" xmlns:cx6="http://schemas.microsoft.com/office/drawing/2016/5/12/chartex" xmlns:cx7="http://schemas.microsoft.com/office/drawing/2016/5/13/chartex" xmlns:cx8="http://schemas.microsoft.com/office/drawing/2016/5/14/chartex" xmlns:mc="http://schemas.openxmlformats.org/markup-compatibility/2006" xmlns:aink="http://schemas.microsoft.com/office/drawing/2016/ink" xmlns:am3d="http://schemas.microsoft.com/office/drawing/2017/model3d" xmlns:o="urn:schemas-microsoft-com:office:office" xmlns:oel="http://schemas.microsoft.com/office/2019/extlst" xmlns:r="http://schemas.openxmlformats.org/officeDocument/2006/relationships" xmlns:m="http://schemas.openxmlformats.org/officeDocument/2006/math" xmlns:v="urn:schemas-microsoft-com:vml" xmlns:wp14="http://schemas.microsoft.com/office/word/2010/wordprocessingDrawing" xmlns:wp="http://schemas.openxmlformats.org/drawingml/2006/wordprocessingDrawing" xmlns:w10="urn:schemas-microsoft-com:office:word" xmlns:w="http://schemas.openxmlformats.org/wordprocessingml/2006/main" xmlns:w14="http://schemas.microsoft.com/office/word/2010/wordml" xmlns:w15="http://schemas.microsoft.com/office/word/2012/wordml" xmlns:w16cex="http://schemas.microsoft.com/office/word/2018/wordml/cex" xmlns:w16cid="http://schemas.microsoft.com/office/word/2016/wordml/cid" xmlns:w16="http://schemas.microsoft.com/office/word/2018/wordml" xmlns:w16du="http://schemas.microsoft.com/office/word/2023/wordml/word16du" xmlns:w16sdtdh="http://schemas.microsoft.com/office/word/2020/wordml/sdtdatahash" xmlns:w16sdtfl="http://schemas.microsoft.com/office/word/2024/wordml/sdtformatlock" xmlns:w16se="http://schemas.microsoft.com/office/word/2015/wordml/symex" xmlns:wpg="http://schemas.microsoft.com/office/word/2010/wordprocessingGroup" xmlns:wpi="http://schemas.microsoft.com/office/word/2010/wordprocessingInk" xmlns:wne="http://schemas.microsoft.com/office/word/2006/wordml" xmlns:wps="http://schemas.microsoft.com/office/word/2010/wordprocessingShape" mc:Ignorable="w14 w15 w16se w16cid w16 w16cex w16sdtdh w16sdtfl w16du wp14">
   <w:footnote w:type="separator" w:id="-1">
     <w:p>
       <w:pPr>
@@ -3660,7 +3573,7 @@
 </file>
 
 <file path=word/header1.xml><?xml version="1.0" encoding="utf-8"?>
-<w:hdr xmlns:wpc="http://schemas.microsoft.com/office/word/2010/wordprocessingCanvas" xmlns:cx="http://schemas.microsoft.com/office/drawing/2014/chartex" xmlns:cx1="http://schemas.microsoft.com/office/drawing/2015/9/8/chartex" xmlns:cx2="http://schemas.microsoft.com/office/drawing/2015/10/21/chartex" xmlns:cx3="http://schemas.microsoft.com/office/drawing/2016/5/9/chartex" xmlns:cx4="http://schemas.microsoft.com/office/drawing/2016/5/10/chartex" xmlns:cx5="http://schemas.microsoft.com/office/drawing/2016/5/11/chartex" xmlns:cx6="http://schemas.microsoft.com/office/drawing/2016/5/12/chartex" xmlns:cx7="http://schemas.microsoft.com/office/drawing/2016/5/13/chartex" xmlns:cx8="http://schemas.microsoft.com/office/drawing/2016/5/14/chartex" xmlns:mc="http://schemas.openxmlformats.org/markup-compatibility/2006" xmlns:aink="http://schemas.microsoft.com/office/drawing/2016/ink" xmlns:am3d="http://schemas.microsoft.com/office/drawing/2017/model3d" xmlns:o="urn:schemas-microsoft-com:office:office" xmlns:oel="http://schemas.microsoft.com/office/2019/extlst" xmlns:r="http://schemas.openxmlformats.org/officeDocument/2006/relationships" xmlns:m="http://schemas.openxmlformats.org/officeDocument/2006/math" xmlns:v="urn:schemas-microsoft-com:vml" xmlns:wp14="http://schemas.microsoft.com/office/word/2010/wordprocessingDrawing" xmlns:wp="http://schemas.openxmlformats.org/drawingml/2006/wordprocessingDrawing" xmlns:w10="urn:schemas-microsoft-com:office:word" xmlns:w="http://schemas.openxmlformats.org/wordprocessingml/2006/main" xmlns:w14="http://schemas.microsoft.com/office/word/2010/wordml" xmlns:w15="http://schemas.microsoft.com/office/word/2012/wordml" xmlns:w16cex="http://schemas.microsoft.com/office/word/2018/wordml/cex" xmlns:w16cid="http://schemas.microsoft.com/office/word/2016/wordml/cid" xmlns:w16="http://schemas.microsoft.com/office/word/2018/wordml" xmlns:w16du="http://schemas.microsoft.com/office/word/2023/wordml/word16du" xmlns:w16sdtdh="http://schemas.microsoft.com/office/word/2020/wordml/sdtdatahash" xmlns:w16se="http://schemas.microsoft.com/office/word/2015/wordml/symex" xmlns:wpg="http://schemas.microsoft.com/office/word/2010/wordprocessingGroup" xmlns:wpi="http://schemas.microsoft.com/office/word/2010/wordprocessingInk" xmlns:wne="http://schemas.microsoft.com/office/word/2006/wordml" xmlns:wps="http://schemas.microsoft.com/office/word/2010/wordprocessingShape" mc:Ignorable="w14 w15 w16se w16cid w16 w16cex w16sdtdh w16du wp14">
+<w:hdr xmlns:wpc="http://schemas.microsoft.com/office/word/2010/wordprocessingCanvas" xmlns:cx="http://schemas.microsoft.com/office/drawing/2014/chartex" xmlns:cx1="http://schemas.microsoft.com/office/drawing/2015/9/8/chartex" xmlns:cx2="http://schemas.microsoft.com/office/drawing/2015/10/21/chartex" xmlns:cx3="http://schemas.microsoft.com/office/drawing/2016/5/9/chartex" xmlns:cx4="http://schemas.microsoft.com/office/drawing/2016/5/10/chartex" xmlns:cx5="http://schemas.microsoft.com/office/drawing/2016/5/11/chartex" xmlns:cx6="http://schemas.microsoft.com/office/drawing/2016/5/12/chartex" xmlns:cx7="http://schemas.microsoft.com/office/drawing/2016/5/13/chartex" xmlns:cx8="http://schemas.microsoft.com/office/drawing/2016/5/14/chartex" xmlns:mc="http://schemas.openxmlformats.org/markup-compatibility/2006" xmlns:aink="http://schemas.microsoft.com/office/drawing/2016/ink" xmlns:am3d="http://schemas.microsoft.com/office/drawing/2017/model3d" xmlns:o="urn:schemas-microsoft-com:office:office" xmlns:oel="http://schemas.microsoft.com/office/2019/extlst" xmlns:r="http://schemas.openxmlformats.org/officeDocument/2006/relationships" xmlns:m="http://schemas.openxmlformats.org/officeDocument/2006/math" xmlns:v="urn:schemas-microsoft-com:vml" xmlns:wp14="http://schemas.microsoft.com/office/word/2010/wordprocessingDrawing" xmlns:wp="http://schemas.openxmlformats.org/drawingml/2006/wordprocessingDrawing" xmlns:w10="urn:schemas-microsoft-com:office:word" xmlns:w="http://schemas.openxmlformats.org/wordprocessingml/2006/main" xmlns:w14="http://schemas.microsoft.com/office/word/2010/wordml" xmlns:w15="http://schemas.microsoft.com/office/word/2012/wordml" xmlns:w16cex="http://schemas.microsoft.com/office/word/2018/wordml/cex" xmlns:w16cid="http://schemas.microsoft.com/office/word/2016/wordml/cid" xmlns:w16="http://schemas.microsoft.com/office/word/2018/wordml" xmlns:w16du="http://schemas.microsoft.com/office/word/2023/wordml/word16du" xmlns:w16sdtdh="http://schemas.microsoft.com/office/word/2020/wordml/sdtdatahash" xmlns:w16sdtfl="http://schemas.microsoft.com/office/word/2024/wordml/sdtformatlock" xmlns:w16se="http://schemas.microsoft.com/office/word/2015/wordml/symex" xmlns:wpg="http://schemas.microsoft.com/office/word/2010/wordprocessingGroup" xmlns:wpi="http://schemas.microsoft.com/office/word/2010/wordprocessingInk" xmlns:wne="http://schemas.microsoft.com/office/word/2006/wordml" xmlns:wps="http://schemas.microsoft.com/office/word/2010/wordprocessingShape" mc:Ignorable="w14 w15 w16se w16cid w16 w16cex w16sdtdh w16sdtfl w16du wp14">
   <w:p>
     <w:pPr>
       <w:pStyle w:val="Header"/>
@@ -3708,7 +3621,7 @@
 </file>
 
 <file path=word/numbering.xml><?xml version="1.0" encoding="utf-8"?>
-<w:numbering xmlns:wpc="http://schemas.microsoft.com/office/word/2010/wordprocessingCanvas" xmlns:cx="http://schemas.microsoft.com/office/drawing/2014/chartex" xmlns:cx1="http://schemas.microsoft.com/office/drawing/2015/9/8/chartex" xmlns:cx2="http://schemas.microsoft.com/office/drawing/2015/10/21/chartex" xmlns:cx3="http://schemas.microsoft.com/office/drawing/2016/5/9/chartex" xmlns:cx4="http://schemas.microsoft.com/office/drawing/2016/5/10/chartex" xmlns:cx5="http://schemas.microsoft.com/office/drawing/2016/5/11/chartex" xmlns:cx6="http://schemas.microsoft.com/office/drawing/2016/5/12/chartex" xmlns:cx7="http://schemas.microsoft.com/office/drawing/2016/5/13/chartex" xmlns:cx8="http://schemas.microsoft.com/office/drawing/2016/5/14/chartex" xmlns:mc="http://schemas.openxmlformats.org/markup-compatibility/2006" xmlns:aink="http://schemas.microsoft.com/office/drawing/2016/ink" xmlns:am3d="http://schemas.microsoft.com/office/drawing/2017/model3d" xmlns:o="urn:schemas-microsoft-com:office:office" xmlns:oel="http://schemas.microsoft.com/office/2019/extlst" xmlns:r="http://schemas.openxmlformats.org/officeDocument/2006/relationships" xmlns:m="http://schemas.openxmlformats.org/officeDocument/2006/math" xmlns:v="urn:schemas-microsoft-com:vml" xmlns:wp14="http://schemas.microsoft.com/office/word/2010/wordprocessingDrawing" xmlns:wp="http://schemas.openxmlformats.org/drawingml/2006/wordprocessingDrawing" xmlns:w10="urn:schemas-microsoft-com:office:word" xmlns:w="http://schemas.openxmlformats.org/wordprocessingml/2006/main" xmlns:w14="http://schemas.microsoft.com/office/word/2010/wordml" xmlns:w15="http://schemas.microsoft.com/office/word/2012/wordml" xmlns:w16cex="http://schemas.microsoft.com/office/word/2018/wordml/cex" xmlns:w16cid="http://schemas.microsoft.com/office/word/2016/wordml/cid" xmlns:w16="http://schemas.microsoft.com/office/word/2018/wordml" xmlns:w16du="http://schemas.microsoft.com/office/word/2023/wordml/word16du" xmlns:w16sdtdh="http://schemas.microsoft.com/office/word/2020/wordml/sdtdatahash" xmlns:w16se="http://schemas.microsoft.com/office/word/2015/wordml/symex" xmlns:wpg="http://schemas.microsoft.com/office/word/2010/wordprocessingGroup" xmlns:wpi="http://schemas.microsoft.com/office/word/2010/wordprocessingInk" xmlns:wne="http://schemas.microsoft.com/office/word/2006/wordml" xmlns:wps="http://schemas.microsoft.com/office/word/2010/wordprocessingShape" mc:Ignorable="w14 w15 w16se w16cid w16 w16cex w16sdtdh w16du wp14">
+<w:numbering xmlns:wpc="http://schemas.microsoft.com/office/word/2010/wordprocessingCanvas" xmlns:cx="http://schemas.microsoft.com/office/drawing/2014/chartex" xmlns:cx1="http://schemas.microsoft.com/office/drawing/2015/9/8/chartex" xmlns:cx2="http://schemas.microsoft.com/office/drawing/2015/10/21/chartex" xmlns:cx3="http://schemas.microsoft.com/office/drawing/2016/5/9/chartex" xmlns:cx4="http://schemas.microsoft.com/office/drawing/2016/5/10/chartex" xmlns:cx5="http://schemas.microsoft.com/office/drawing/2016/5/11/chartex" xmlns:cx6="http://schemas.microsoft.com/office/drawing/2016/5/12/chartex" xmlns:cx7="http://schemas.microsoft.com/office/drawing/2016/5/13/chartex" xmlns:cx8="http://schemas.microsoft.com/office/drawing/2016/5/14/chartex" xmlns:mc="http://schemas.openxmlformats.org/markup-compatibility/2006" xmlns:aink="http://schemas.microsoft.com/office/drawing/2016/ink" xmlns:am3d="http://schemas.microsoft.com/office/drawing/2017/model3d" xmlns:o="urn:schemas-microsoft-com:office:office" xmlns:oel="http://schemas.microsoft.com/office/2019/extlst" xmlns:r="http://schemas.openxmlformats.org/officeDocument/2006/relationships" xmlns:m="http://schemas.openxmlformats.org/officeDocument/2006/math" xmlns:v="urn:schemas-microsoft-com:vml" xmlns:wp14="http://schemas.microsoft.com/office/word/2010/wordprocessingDrawing" xmlns:wp="http://schemas.openxmlformats.org/drawingml/2006/wordprocessingDrawing" xmlns:w10="urn:schemas-microsoft-com:office:word" xmlns:w="http://schemas.openxmlformats.org/wordprocessingml/2006/main" xmlns:w14="http://schemas.microsoft.com/office/word/2010/wordml" xmlns:w15="http://schemas.microsoft.com/office/word/2012/wordml" xmlns:w16cex="http://schemas.microsoft.com/office/word/2018/wordml/cex" xmlns:w16cid="http://schemas.microsoft.com/office/word/2016/wordml/cid" xmlns:w16="http://schemas.microsoft.com/office/word/2018/wordml" xmlns:w16du="http://schemas.microsoft.com/office/word/2023/wordml/word16du" xmlns:w16sdtdh="http://schemas.microsoft.com/office/word/2020/wordml/sdtdatahash" xmlns:w16sdtfl="http://schemas.microsoft.com/office/word/2024/wordml/sdtformatlock" xmlns:w16se="http://schemas.microsoft.com/office/word/2015/wordml/symex" xmlns:wpg="http://schemas.microsoft.com/office/word/2010/wordprocessingGroup" xmlns:wpi="http://schemas.microsoft.com/office/word/2010/wordprocessingInk" xmlns:wne="http://schemas.microsoft.com/office/word/2006/wordml" xmlns:wps="http://schemas.microsoft.com/office/word/2010/wordprocessingShape" mc:Ignorable="w14 w15 w16se w16cid w16 w16cex w16sdtdh w16sdtfl w16du wp14">
   <w:abstractNum w:abstractNumId="0" w15:restartNumberingAfterBreak="0">
     <w:nsid w:val="FFFFFF1D"/>
     <w:multiLevelType w:val="multilevel"/>
@@ -5652,7 +5565,7 @@
 </file>
 
 <file path=word/styles.xml><?xml version="1.0" encoding="utf-8"?>
-<w:styles xmlns:mc="http://schemas.openxmlformats.org/markup-compatibility/2006" xmlns:r="http://schemas.openxmlformats.org/officeDocument/2006/relationships" xmlns:w="http://schemas.openxmlformats.org/wordprocessingml/2006/main" xmlns:w14="http://schemas.microsoft.com/office/word/2010/wordml" xmlns:w15="http://schemas.microsoft.com/office/word/2012/wordml" xmlns:w16cex="http://schemas.microsoft.com/office/word/2018/wordml/cex" xmlns:w16cid="http://schemas.microsoft.com/office/word/2016/wordml/cid" xmlns:w16="http://schemas.microsoft.com/office/word/2018/wordml" xmlns:w16du="http://schemas.microsoft.com/office/word/2023/wordml/word16du" xmlns:w16sdtdh="http://schemas.microsoft.com/office/word/2020/wordml/sdtdatahash" xmlns:w16se="http://schemas.microsoft.com/office/word/2015/wordml/symex" mc:Ignorable="w14 w15 w16se w16cid w16 w16cex w16sdtdh w16du">
+<w:styles xmlns:mc="http://schemas.openxmlformats.org/markup-compatibility/2006" xmlns:r="http://schemas.openxmlformats.org/officeDocument/2006/relationships" xmlns:w="http://schemas.openxmlformats.org/wordprocessingml/2006/main" xmlns:w14="http://schemas.microsoft.com/office/word/2010/wordml" xmlns:w15="http://schemas.microsoft.com/office/word/2012/wordml" xmlns:w16cex="http://schemas.microsoft.com/office/word/2018/wordml/cex" xmlns:w16cid="http://schemas.microsoft.com/office/word/2016/wordml/cid" xmlns:w16="http://schemas.microsoft.com/office/word/2018/wordml" xmlns:w16du="http://schemas.microsoft.com/office/word/2023/wordml/word16du" xmlns:w16sdtdh="http://schemas.microsoft.com/office/word/2020/wordml/sdtdatahash" xmlns:w16sdtfl="http://schemas.microsoft.com/office/word/2024/wordml/sdtformatlock" xmlns:w16se="http://schemas.microsoft.com/office/word/2015/wordml/symex" mc:Ignorable="w14 w15 w16se w16cid w16 w16cex w16sdtdh w16sdtfl w16du">
   <w:docDefaults>
     <w:rPrDefault>
       <w:rPr>
@@ -6036,6 +5949,7 @@
   <w:style w:type="character" w:default="1" w:styleId="DefaultParagraphFont">
     <w:name w:val="Default Paragraph Font"/>
     <w:uiPriority w:val="1"/>
+    <w:semiHidden/>
     <w:unhideWhenUsed/>
   </w:style>
   <w:style w:type="table" w:default="1" w:styleId="TableNormal">

</xml_diff>